<commit_message>
Refresh Durvalumab patent analysis outputs
Rerun the complete Patent Skill pipeline against the current case inputs, regenerate reports, FTO artifacts, landscapes, and graph data, and refresh the source registry snapshot. Correct the case state path for local reproducibility.
</commit_message>
<xml_diff>
--- a/cases/durvalumab-pdl1-nsclc/durvalumab-pdl1-nsclc-fto-report.docx
+++ b/cases/durvalumab-pdl1-nsclc/durvalumab-pdl1-nsclc-fto-report.docx
@@ -32,9 +32,7 @@
           <w:color w:val="17365D"/>
           <w:sz w:val="46"/>
         </w:rPr>
-        <w:t>一种度伐利尤单抗治疗 NSCLC 的</w:t>
-        <w:br/>
-        <w:t>免疫相关不良反应评估方法</w:t>
+        <w:t>肿瘤免疫治疗监测，具体涉及 PD-L1 抑制剂度伐利尤单抗在非小细胞肺癌中的免疫相关不良反应风险评估。度伐利尤单抗与 PD-L1 结合并阻断 …</w:t>
       </w:r>
     </w:p>
     <w:p>
@@ -66,7 +64,7 @@
           <w:color w:val="1F2937"/>
           <w:sz w:val="21"/>
         </w:rPr>
-        <w:t>报告基准日：2026-08-06  ·  研究区域：CN, US, WO, EP</w:t>
+        <w:t>报告基准日：2026-08-07  ·  研究区域：CN, US, WO, EP</w:t>
       </w:r>
     </w:p>
     <w:tbl>
@@ -303,7 +301,7 @@
                 <w:color w:val="2E74B5"/>
                 <w:sz w:val="26"/>
               </w:rPr>
-              <w:t>1</w:t>
+              <w:t>4</w:t>
             </w:r>
           </w:p>
         </w:tc>
@@ -431,7 +429,7 @@
                 <w:color w:val="1F2937"/>
                 <w:sz w:val="20"/>
               </w:rPr>
-              <w:t>在现有公开专利数据和已记录权利要求要素范围内，尚不足以确认拟实施方案落入某一目标法域的有效独立权利要求。DVL-FAM-004 / WO2022248478A1 因同时命中研究对象/适应症与 PD-L1 阻断核心簇，被列为中优先复核；其肺部监测、生化检测等必要特征仍为部分命中，必须回到完整权利要求和国家阶段状态核验。</w:t>
+              <w:t>在现有公开专利数据和已记录权利要求要素范围内，尚不足以确认拟实施方案落入某一目标法域的有效独立权利要求。优先复核对象为 DVL-FAM-004 / WO2022248478A1、DVL-FAM-002 / US20190256603A1、DVL-FAM-007 / WO2024234348A1；应回到完整独立权利要求、国家阶段和官方状态逐项核验。</w:t>
             </w:r>
           </w:p>
         </w:tc>
@@ -470,7 +468,7 @@
           <w:color w:val="1F2937"/>
           <w:sz w:val="21"/>
         </w:rPr>
-        <w:t>技术方案围绕度伐利尤单抗、PD-L1/PD-1 通路、NSCLC 和免疫相关不良反应监测展开。</w:t>
+        <w:t>技术方案围绕 Durvalumab、PD-L1 和 non-small cell lung cancer (NSCLC) 展开。</w:t>
       </w:r>
     </w:p>
     <w:p>
@@ -541,7 +539,7 @@
           <w:color w:val="1F2937"/>
           <w:sz w:val="21"/>
         </w:rPr>
-        <w:t>度伐利尤单抗（Durvalumab / MEDI4736 / Imfinzi）作为 PD-L1 抑制剂，用于非小细胞肺癌（NSCLC）相关免疫不良反应风险评估。</w:t>
+        <w:t>Durvalumab；靶点/机制：PD-L1；适应症/用途：non-small cell lung cancer (NSCLC)。</w:t>
       </w:r>
     </w:p>
     <w:p>
@@ -591,7 +589,7 @@
           <w:color w:val="1F2937"/>
           <w:sz w:val="21"/>
         </w:rPr>
-        <w:t>截至 2026-08-06 的公开记录；未公开申请、未核验的国家阶段或状态变化不在本报告中假定。</w:t>
+        <w:t>截至 2026-08-07 的公开记录；未公开申请、未核验的国家阶段或状态变化不在本报告中假定。</w:t>
       </w:r>
     </w:p>
     <w:p>
@@ -714,7 +712,7 @@
           <w:color w:val="17365D"/>
           <w:sz w:val="21"/>
         </w:rPr>
-        <w:t>拟实施方案中的风险评估逻辑包括：</w:t>
+        <w:t>拟实施方案中的结构化技术特征包括：</w:t>
       </w:r>
     </w:p>
     <w:p>
@@ -729,7 +727,7 @@
           <w:color w:val="1F2937"/>
           <w:sz w:val="21"/>
         </w:rPr>
-        <w:t>通过度伐利尤单抗与 PD-L1 结合并阻断 PD-1/PD-L1 通路，识别免疫相关不良反应风险；</w:t>
+        <w:t>肿瘤免疫治疗监测，具体涉及 PD-L1 抑制剂度伐利尤单抗在非小细胞肺癌中的免疫相关不良反应风险评估。</w:t>
       </w:r>
     </w:p>
     <w:p>
@@ -744,7 +742,7 @@
           <w:color w:val="1F2937"/>
           <w:sz w:val="21"/>
         </w:rPr>
-        <w:t>在治疗期间连续监测肺部体征，并结合胸部 CT、磨玻璃影或斑片状浸润等影像线索识别免疫相关性肺炎；</w:t>
+        <w:t>度伐利尤单抗与 PD-L1 结合并阻断 PD-1/PD-L1 通路，以触发免疫相关不良反应的风险识别。</w:t>
       </w:r>
     </w:p>
     <w:p>
@@ -759,7 +757,7 @@
           <w:color w:val="1F2937"/>
           <w:sz w:val="21"/>
         </w:rPr>
-        <w:t>在基线和治疗期间检测 ALT、AST、肌酐、TSH、游离 T4 和血糖，评估肝肾及内分泌受累；</w:t>
+        <w:t>免疫系统在 PD-1/PD-L1 通路被阻断后对肺部正常组织、肠道黏膜或实质器官产生异常攻击，用于判定器官特异性毒性机制。</w:t>
       </w:r>
     </w:p>
     <w:p>
@@ -774,7 +772,7 @@
           <w:color w:val="1F2937"/>
           <w:sz w:val="21"/>
         </w:rPr>
-        <w:t>根据腹泻/结肠炎分级启动皮质类固醇治疗，控制免疫相关性结肠炎进展。</w:t>
+        <w:t>治疗期间对肺部体征进行连续监测，以识别免疫相关性肺炎的呼吸系统异常表现。</w:t>
       </w:r>
     </w:p>
     <w:p>
@@ -2097,7 +2095,7 @@
                 <w:color w:val="1F2937"/>
                 <w:sz w:val="16"/>
               </w:rPr>
-              <w:t>MEDIUM</w:t>
+              <w:t>HIGH</w:t>
             </w:r>
           </w:p>
         </w:tc>
@@ -2119,7 +2117,7 @@
                 <w:color w:val="1F2937"/>
                 <w:sz w:val="16"/>
               </w:rPr>
-              <w:t>0.79</w:t>
+              <w:t>0.87</w:t>
             </w:r>
           </w:p>
         </w:tc>
@@ -2141,7 +2139,7 @@
                 <w:color w:val="1F2937"/>
                 <w:sz w:val="16"/>
               </w:rPr>
-              <w:t>F01, F02</w:t>
+              <w:t>F01, F02, F03, F04, F05</w:t>
             </w:r>
           </w:p>
         </w:tc>
@@ -2253,7 +2251,7 @@
                 <w:color w:val="1F2937"/>
                 <w:sz w:val="16"/>
               </w:rPr>
-              <w:t>LOW</w:t>
+              <w:t>HIGH</w:t>
             </w:r>
           </w:p>
         </w:tc>
@@ -2275,7 +2273,7 @@
                 <w:color w:val="1F2937"/>
                 <w:sz w:val="16"/>
               </w:rPr>
-              <w:t>0.51</w:t>
+              <w:t>0.74</w:t>
             </w:r>
           </w:p>
         </w:tc>
@@ -2297,7 +2295,7 @@
                 <w:color w:val="1F2937"/>
                 <w:sz w:val="16"/>
               </w:rPr>
-              <w:t>F01</w:t>
+              <w:t>F01, F02, F04, F05</w:t>
             </w:r>
           </w:p>
         </w:tc>
@@ -2343,7 +2341,7 @@
                 <w:color w:val="1F2937"/>
                 <w:sz w:val="16"/>
               </w:rPr>
-              <w:t>DVL-FAM-001</w:t>
+              <w:t>DVL-FAM-007</w:t>
             </w:r>
           </w:p>
         </w:tc>
@@ -2365,7 +2363,7 @@
                 <w:color w:val="1F2937"/>
                 <w:sz w:val="16"/>
               </w:rPr>
-              <w:t>US9493565B2</w:t>
+              <w:t>WO2024234348A1</w:t>
             </w:r>
           </w:p>
         </w:tc>
@@ -2387,7 +2385,7 @@
                 <w:color w:val="1F2937"/>
                 <w:sz w:val="16"/>
               </w:rPr>
-              <w:t>Fc-optimized anti-PD-L1 antibody (durvalumab/MEDI4736) composition and sequence</w:t>
+              <w:t>Biomarker for immune checkpoint blockade therapy in NSCLC</w:t>
             </w:r>
           </w:p>
         </w:tc>
@@ -2409,7 +2407,7 @@
                 <w:color w:val="1F2937"/>
                 <w:sz w:val="16"/>
               </w:rPr>
-              <w:t>LOW</w:t>
+              <w:t>HIGH</w:t>
             </w:r>
           </w:p>
         </w:tc>
@@ -2431,7 +2429,7 @@
                 <w:color w:val="1F2937"/>
                 <w:sz w:val="16"/>
               </w:rPr>
-              <w:t>0.41</w:t>
+              <w:t>0.63</w:t>
             </w:r>
           </w:p>
         </w:tc>
@@ -2453,7 +2451,7 @@
                 <w:color w:val="1F2937"/>
                 <w:sz w:val="16"/>
               </w:rPr>
-              <w:t>—</w:t>
+              <w:t>F01, F02, F04, F05</w:t>
             </w:r>
           </w:p>
         </w:tc>
@@ -2475,7 +2473,7 @@
                 <w:color w:val="1F2937"/>
                 <w:sz w:val="16"/>
               </w:rPr>
-              <w:t>US public mirror shows active; CN and other national members require official-register review</w:t>
+              <w:t>WO record shown ceased; not durvalumab-specific in the rapid screen</w:t>
             </w:r>
           </w:p>
         </w:tc>
@@ -2499,7 +2497,7 @@
                 <w:color w:val="1F2937"/>
                 <w:sz w:val="16"/>
               </w:rPr>
-              <w:t>DVL-FAM-007</w:t>
+              <w:t>DVL-FAM-001</w:t>
             </w:r>
           </w:p>
         </w:tc>
@@ -2521,7 +2519,7 @@
                 <w:color w:val="1F2937"/>
                 <w:sz w:val="16"/>
               </w:rPr>
-              <w:t>WO2024234348A1</w:t>
+              <w:t>US9493565B2</w:t>
             </w:r>
           </w:p>
         </w:tc>
@@ -2543,7 +2541,7 @@
                 <w:color w:val="1F2937"/>
                 <w:sz w:val="16"/>
               </w:rPr>
-              <w:t>Biomarker for immune checkpoint blockade therapy in NSCLC</w:t>
+              <w:t>Fc-optimized anti-PD-L1 antibody (durvalumab/MEDI4736) composition and sequence</w:t>
             </w:r>
           </w:p>
         </w:tc>
@@ -2565,7 +2563,7 @@
                 <w:color w:val="1F2937"/>
                 <w:sz w:val="16"/>
               </w:rPr>
-              <w:t>LOW</w:t>
+              <w:t>MEDIUM</w:t>
             </w:r>
           </w:p>
         </w:tc>
@@ -2587,7 +2585,7 @@
                 <w:color w:val="1F2937"/>
                 <w:sz w:val="16"/>
               </w:rPr>
-              <w:t>0.40</w:t>
+              <w:t>0.56</w:t>
             </w:r>
           </w:p>
         </w:tc>
@@ -2609,7 +2607,7 @@
                 <w:color w:val="1F2937"/>
                 <w:sz w:val="16"/>
               </w:rPr>
-              <w:t>F01</w:t>
+              <w:t>F02</w:t>
             </w:r>
           </w:p>
         </w:tc>
@@ -2631,7 +2629,7 @@
                 <w:color w:val="1F2937"/>
                 <w:sz w:val="16"/>
               </w:rPr>
-              <w:t>WO record shown ceased; not durvalumab-specific in the rapid screen</w:t>
+              <w:t>US public mirror shows active; CN and other national members require official-register review</w:t>
             </w:r>
           </w:p>
         </w:tc>
@@ -2721,7 +2719,7 @@
                 <w:color w:val="1F2937"/>
                 <w:sz w:val="16"/>
               </w:rPr>
-              <w:t>LOW</w:t>
+              <w:t>MEDIUM</w:t>
             </w:r>
           </w:p>
         </w:tc>
@@ -2743,7 +2741,7 @@
                 <w:color w:val="1F2937"/>
                 <w:sz w:val="16"/>
               </w:rPr>
-              <w:t>0.38</w:t>
+              <w:t>0.53</w:t>
             </w:r>
           </w:p>
         </w:tc>
@@ -2765,7 +2763,7 @@
                 <w:color w:val="1F2937"/>
                 <w:sz w:val="16"/>
               </w:rPr>
-              <w:t>—</w:t>
+              <w:t>F02</w:t>
             </w:r>
           </w:p>
         </w:tc>
@@ -2811,7 +2809,7 @@
                 <w:color w:val="1F2937"/>
                 <w:sz w:val="16"/>
               </w:rPr>
-              <w:t>DVL-FAM-003</w:t>
+              <w:t>DVL-FAM-006</w:t>
             </w:r>
           </w:p>
         </w:tc>
@@ -2833,7 +2831,7 @@
                 <w:color w:val="1F2937"/>
                 <w:sz w:val="16"/>
               </w:rPr>
-              <w:t>WO2024213696A1</w:t>
+              <w:t>WO2019165434A1</w:t>
             </w:r>
           </w:p>
         </w:tc>
@@ -2855,7 +2853,7 @@
                 <w:color w:val="1F2937"/>
                 <w:sz w:val="16"/>
               </w:rPr>
-              <w:t>Durvalumab plus platinum chemotherapy for resectable NSCLC</w:t>
+              <w:t>Anti-TIGIT plus anti-PD-L1 antagonist dosing</w:t>
             </w:r>
           </w:p>
         </w:tc>
@@ -2877,7 +2875,7 @@
                 <w:color w:val="1F2937"/>
                 <w:sz w:val="16"/>
               </w:rPr>
-              <w:t>LOW</w:t>
+              <w:t>MEDIUM</w:t>
             </w:r>
           </w:p>
         </w:tc>
@@ -2899,7 +2897,7 @@
                 <w:color w:val="1F2937"/>
                 <w:sz w:val="16"/>
               </w:rPr>
-              <w:t>0.35</w:t>
+              <w:t>0.45</w:t>
             </w:r>
           </w:p>
         </w:tc>
@@ -2921,7 +2919,7 @@
                 <w:color w:val="1F2937"/>
                 <w:sz w:val="16"/>
               </w:rPr>
-              <w:t>F01</w:t>
+              <w:t>F02</w:t>
             </w:r>
           </w:p>
         </w:tc>
@@ -2943,7 +2941,7 @@
                 <w:color w:val="1F2937"/>
                 <w:sz w:val="16"/>
               </w:rPr>
-              <w:t>WO PCT record shown ceased; AU/CN/EP/KR/IL national or regional members identified on public mirror; live status requires official-register confirmat…</w:t>
+              <w:t>WO record shown ceased; national status differs by jurisdiction</w:t>
             </w:r>
           </w:p>
         </w:tc>
@@ -2967,7 +2965,7 @@
                 <w:color w:val="1F2937"/>
                 <w:sz w:val="16"/>
               </w:rPr>
-              <w:t>DVL-FAM-006</w:t>
+              <w:t>DVL-FAM-003</w:t>
             </w:r>
           </w:p>
         </w:tc>
@@ -2989,7 +2987,7 @@
                 <w:color w:val="1F2937"/>
                 <w:sz w:val="16"/>
               </w:rPr>
-              <w:t>WO2019165434A1</w:t>
+              <w:t>WO2024213696A1</w:t>
             </w:r>
           </w:p>
         </w:tc>
@@ -3011,7 +3009,7 @@
                 <w:color w:val="1F2937"/>
                 <w:sz w:val="16"/>
               </w:rPr>
-              <w:t>Anti-TIGIT plus anti-PD-L1 antagonist dosing</w:t>
+              <w:t>Durvalumab plus platinum chemotherapy for resectable NSCLC</w:t>
             </w:r>
           </w:p>
         </w:tc>
@@ -3033,7 +3031,7 @@
                 <w:color w:val="1F2937"/>
                 <w:sz w:val="16"/>
               </w:rPr>
-              <w:t>LOW</w:t>
+              <w:t>MEDIUM</w:t>
             </w:r>
           </w:p>
         </w:tc>
@@ -3055,7 +3053,7 @@
                 <w:color w:val="1F2937"/>
                 <w:sz w:val="16"/>
               </w:rPr>
-              <w:t>0.30</w:t>
+              <w:t>0.43</w:t>
             </w:r>
           </w:p>
         </w:tc>
@@ -3077,7 +3075,7 @@
                 <w:color w:val="1F2937"/>
                 <w:sz w:val="16"/>
               </w:rPr>
-              <w:t>—</w:t>
+              <w:t>F01, F04, F05</w:t>
             </w:r>
           </w:p>
         </w:tc>
@@ -3099,7 +3097,7 @@
                 <w:color w:val="1F2937"/>
                 <w:sz w:val="16"/>
               </w:rPr>
-              <w:t>WO record shown ceased; national status differs by jurisdiction</w:t>
+              <w:t>WO PCT record shown ceased; AU/CN/EP/KR/IL national or regional members identified on public mirror; live status requires official-register confirmat…</w:t>
             </w:r>
           </w:p>
         </w:tc>
@@ -3438,7 +3436,7 @@
                 <w:color w:val="1F2937"/>
                 <w:sz w:val="16"/>
               </w:rPr>
-              <w:t>F01, F02, F03, F04, F05</w:t>
+              <w:t>F02</w:t>
             </w:r>
           </w:p>
         </w:tc>
@@ -3582,7 +3580,7 @@
                 <w:color w:val="1F2937"/>
                 <w:sz w:val="16"/>
               </w:rPr>
-              <w:t>F01, F02, F03, F04, F05</w:t>
+              <w:t>F02</w:t>
             </w:r>
           </w:p>
         </w:tc>
@@ -3726,7 +3724,7 @@
                 <w:color w:val="1F2937"/>
                 <w:sz w:val="16"/>
               </w:rPr>
-              <w:t>F01</w:t>
+              <w:t>F01, F02, F04, F05</w:t>
             </w:r>
           </w:p>
         </w:tc>
@@ -3870,7 +3868,7 @@
                 <w:color w:val="1F2937"/>
                 <w:sz w:val="16"/>
               </w:rPr>
-              <w:t>F01</w:t>
+              <w:t>F01, F02, F04, F05</w:t>
             </w:r>
           </w:p>
         </w:tc>
@@ -4014,7 +4012,7 @@
                 <w:color w:val="1F2937"/>
                 <w:sz w:val="16"/>
               </w:rPr>
-              <w:t>F01</w:t>
+              <w:t>F01, F04, F05</w:t>
             </w:r>
           </w:p>
         </w:tc>
@@ -4158,7 +4156,7 @@
                 <w:color w:val="1F2937"/>
                 <w:sz w:val="16"/>
               </w:rPr>
-              <w:t>F01, F02</w:t>
+              <w:t>F01, F02, F03, F04, F05</w:t>
             </w:r>
           </w:p>
         </w:tc>
@@ -4302,7 +4300,7 @@
                 <w:color w:val="1F2937"/>
                 <w:sz w:val="16"/>
               </w:rPr>
-              <w:t>F01, F02, F03, F04, F05</w:t>
+              <w:t>F02</w:t>
             </w:r>
           </w:p>
         </w:tc>
@@ -4446,7 +4444,7 @@
                 <w:color w:val="1F2937"/>
                 <w:sz w:val="16"/>
               </w:rPr>
-              <w:t>F01, F02, F03, F04, F05</w:t>
+              <w:t>F02</w:t>
             </w:r>
           </w:p>
         </w:tc>
@@ -4590,7 +4588,7 @@
                 <w:color w:val="1F2937"/>
                 <w:sz w:val="16"/>
               </w:rPr>
-              <w:t>F01</w:t>
+              <w:t>F01, F02, F04, F05</w:t>
             </w:r>
           </w:p>
         </w:tc>
@@ -4936,7 +4934,7 @@
                 <w:color w:val="1F2937"/>
                 <w:sz w:val="17"/>
               </w:rPr>
-              <w:t>MEDIUM</w:t>
+              <w:t>HIGH</w:t>
             </w:r>
           </w:p>
         </w:tc>
@@ -4980,7 +4978,7 @@
                 <w:color w:val="1F2937"/>
                 <w:sz w:val="17"/>
               </w:rPr>
-              <w:t>F01, F02</w:t>
+              <w:t>F01, F02, F03, F04, F05</w:t>
             </w:r>
           </w:p>
         </w:tc>
@@ -5002,7 +5000,7 @@
                 <w:color w:val="1F2937"/>
                 <w:sz w:val="17"/>
               </w:rPr>
-              <w:t>F03, F04, F05</w:t>
+              <w:t>—</w:t>
             </w:r>
           </w:p>
         </w:tc>
@@ -5070,7 +5068,7 @@
                 <w:color w:val="1F2937"/>
                 <w:sz w:val="17"/>
               </w:rPr>
-              <w:t>LOW</w:t>
+              <w:t>HIGH</w:t>
             </w:r>
           </w:p>
         </w:tc>
@@ -5114,7 +5112,7 @@
                 <w:color w:val="1F2937"/>
                 <w:sz w:val="17"/>
               </w:rPr>
-              <w:t>F01</w:t>
+              <w:t>F01, F02, F04, F05</w:t>
             </w:r>
           </w:p>
         </w:tc>
@@ -5136,7 +5134,7 @@
                 <w:color w:val="1F2937"/>
                 <w:sz w:val="17"/>
               </w:rPr>
-              <w:t>F02, F03, F04, F05</w:t>
+              <w:t>F03</w:t>
             </w:r>
           </w:p>
         </w:tc>
@@ -5182,7 +5180,7 @@
                 <w:color w:val="1F2937"/>
                 <w:sz w:val="17"/>
               </w:rPr>
-              <w:t>DVL-FAM-001</w:t>
+              <w:t>DVL-FAM-007</w:t>
             </w:r>
           </w:p>
         </w:tc>
@@ -5204,7 +5202,7 @@
                 <w:color w:val="1F2937"/>
                 <w:sz w:val="17"/>
               </w:rPr>
-              <w:t>LOW</w:t>
+              <w:t>HIGH</w:t>
             </w:r>
           </w:p>
         </w:tc>
@@ -5226,7 +5224,7 @@
                 <w:color w:val="1F2937"/>
                 <w:sz w:val="17"/>
               </w:rPr>
-              <w:t>core</w:t>
+              <w:t>boundary</w:t>
             </w:r>
           </w:p>
         </w:tc>
@@ -5248,7 +5246,7 @@
                 <w:color w:val="1F2937"/>
                 <w:sz w:val="17"/>
               </w:rPr>
-              <w:t>—</w:t>
+              <w:t>F01, F02, F04, F05</w:t>
             </w:r>
           </w:p>
         </w:tc>
@@ -5270,7 +5268,7 @@
                 <w:color w:val="1F2937"/>
                 <w:sz w:val="17"/>
               </w:rPr>
-              <w:t>F01, F02, F03, F04, F05</w:t>
+              <w:t>F03</w:t>
             </w:r>
           </w:p>
         </w:tc>
@@ -5292,7 +5290,7 @@
                 <w:color w:val="1F2937"/>
                 <w:sz w:val="17"/>
               </w:rPr>
-              <w:t>Google Patents public mirror; USPTO link available on record</w:t>
+              <w:t>Google Patents public mirror; claim-level linkage to durvalumab not established</w:t>
             </w:r>
           </w:p>
         </w:tc>
@@ -5316,7 +5314,7 @@
                 <w:color w:val="1F2937"/>
                 <w:sz w:val="17"/>
               </w:rPr>
-              <w:t>DVL-FAM-007</w:t>
+              <w:t>DVL-FAM-001</w:t>
             </w:r>
           </w:p>
         </w:tc>
@@ -5338,7 +5336,7 @@
                 <w:color w:val="1F2937"/>
                 <w:sz w:val="17"/>
               </w:rPr>
-              <w:t>LOW</w:t>
+              <w:t>MEDIUM</w:t>
             </w:r>
           </w:p>
         </w:tc>
@@ -5360,7 +5358,7 @@
                 <w:color w:val="1F2937"/>
                 <w:sz w:val="17"/>
               </w:rPr>
-              <w:t>boundary</w:t>
+              <w:t>core</w:t>
             </w:r>
           </w:p>
         </w:tc>
@@ -5382,7 +5380,7 @@
                 <w:color w:val="1F2937"/>
                 <w:sz w:val="17"/>
               </w:rPr>
-              <w:t>F01</w:t>
+              <w:t>F02</w:t>
             </w:r>
           </w:p>
         </w:tc>
@@ -5404,7 +5402,7 @@
                 <w:color w:val="1F2937"/>
                 <w:sz w:val="17"/>
               </w:rPr>
-              <w:t>F02, F03, F04, F05</w:t>
+              <w:t>F01, F03, F04, F05</w:t>
             </w:r>
           </w:p>
         </w:tc>
@@ -5426,7 +5424,7 @@
                 <w:color w:val="1F2937"/>
                 <w:sz w:val="17"/>
               </w:rPr>
-              <w:t>Google Patents public mirror; claim-level linkage to durvalumab not established</w:t>
+              <w:t>Google Patents public mirror; USPTO link available on record</w:t>
             </w:r>
           </w:p>
         </w:tc>
@@ -5472,7 +5470,7 @@
                 <w:color w:val="1F2937"/>
                 <w:sz w:val="17"/>
               </w:rPr>
-              <w:t>LOW</w:t>
+              <w:t>MEDIUM</w:t>
             </w:r>
           </w:p>
         </w:tc>
@@ -5516,7 +5514,7 @@
                 <w:color w:val="1F2937"/>
                 <w:sz w:val="17"/>
               </w:rPr>
-              <w:t>—</w:t>
+              <w:t>F02</w:t>
             </w:r>
           </w:p>
         </w:tc>
@@ -5538,7 +5536,7 @@
                 <w:color w:val="1F2937"/>
                 <w:sz w:val="17"/>
               </w:rPr>
-              <w:t>F01, F02, F03, F04, F05</w:t>
+              <w:t>F01, F03, F04, F05</w:t>
             </w:r>
           </w:p>
         </w:tc>
@@ -5584,7 +5582,7 @@
                 <w:color w:val="1F2937"/>
                 <w:sz w:val="17"/>
               </w:rPr>
-              <w:t>DVL-FAM-003</w:t>
+              <w:t>DVL-FAM-006</w:t>
             </w:r>
           </w:p>
         </w:tc>
@@ -5606,7 +5604,7 @@
                 <w:color w:val="1F2937"/>
                 <w:sz w:val="17"/>
               </w:rPr>
-              <w:t>LOW</w:t>
+              <w:t>MEDIUM</w:t>
             </w:r>
           </w:p>
         </w:tc>
@@ -5628,7 +5626,7 @@
                 <w:color w:val="1F2937"/>
                 <w:sz w:val="17"/>
               </w:rPr>
-              <w:t>core</w:t>
+              <w:t>boundary</w:t>
             </w:r>
           </w:p>
         </w:tc>
@@ -5650,7 +5648,7 @@
                 <w:color w:val="1F2937"/>
                 <w:sz w:val="17"/>
               </w:rPr>
-              <w:t>F01</w:t>
+              <w:t>F02</w:t>
             </w:r>
           </w:p>
         </w:tc>
@@ -5672,7 +5670,7 @@
                 <w:color w:val="1F2937"/>
                 <w:sz w:val="17"/>
               </w:rPr>
-              <w:t>F02, F04, F05</w:t>
+              <w:t>F01, F03, F04, F05</w:t>
             </w:r>
           </w:p>
         </w:tc>
@@ -5694,7 +5692,7 @@
                 <w:color w:val="1F2937"/>
                 <w:sz w:val="17"/>
               </w:rPr>
-              <w:t>Google Patents public mirror; national register follow-up required</w:t>
+              <w:t>Google Patents public mirror; official register review required</w:t>
             </w:r>
           </w:p>
         </w:tc>
@@ -5718,7 +5716,7 @@
                 <w:color w:val="1F2937"/>
                 <w:sz w:val="17"/>
               </w:rPr>
-              <w:t>DVL-FAM-006</w:t>
+              <w:t>DVL-FAM-003</w:t>
             </w:r>
           </w:p>
         </w:tc>
@@ -5740,7 +5738,7 @@
                 <w:color w:val="1F2937"/>
                 <w:sz w:val="17"/>
               </w:rPr>
-              <w:t>LOW</w:t>
+              <w:t>MEDIUM</w:t>
             </w:r>
           </w:p>
         </w:tc>
@@ -5762,7 +5760,7 @@
                 <w:color w:val="1F2937"/>
                 <w:sz w:val="17"/>
               </w:rPr>
-              <w:t>boundary</w:t>
+              <w:t>core</w:t>
             </w:r>
           </w:p>
         </w:tc>
@@ -5784,7 +5782,7 @@
                 <w:color w:val="1F2937"/>
                 <w:sz w:val="17"/>
               </w:rPr>
-              <w:t>—</w:t>
+              <w:t>F01, F04, F05</w:t>
             </w:r>
           </w:p>
         </w:tc>
@@ -5806,7 +5804,7 @@
                 <w:color w:val="1F2937"/>
                 <w:sz w:val="17"/>
               </w:rPr>
-              <w:t>F01, F02, F03, F04, F05</w:t>
+              <w:t>F02</w:t>
             </w:r>
           </w:p>
         </w:tc>
@@ -5828,7 +5826,7 @@
                 <w:color w:val="1F2937"/>
                 <w:sz w:val="17"/>
               </w:rPr>
-              <w:t>Google Patents public mirror; official register review required</w:t>
+              <w:t>Google Patents public mirror; national register follow-up required</w:t>
             </w:r>
           </w:p>
         </w:tc>
@@ -6111,7 +6109,7 @@
                 <w:color w:val="1F2937"/>
                 <w:sz w:val="17"/>
               </w:rPr>
-              <w:t>LOW · 初筛分数 0.4148</w:t>
+              <w:t>MEDIUM · 初筛分数 0.5648</w:t>
             </w:r>
           </w:p>
         </w:tc>
@@ -6249,7 +6247,7 @@
                 <w:color w:val="1F2937"/>
                 <w:sz w:val="17"/>
               </w:rPr>
-              <w:t>无 / F01, F02, F03, F04, F05</w:t>
+              <w:t>F02 / F01, F03, F04, F05</w:t>
             </w:r>
           </w:p>
         </w:tc>
@@ -6323,7 +6321,7 @@
           <w:color w:val="1F2937"/>
           <w:sz w:val="19"/>
         </w:rPr>
-        <w:t>当前特征工程只形成部分或背景层命中，尚不足以作为实施障碍结论；仍应检查同族分支、国家阶段、分案/继续申请及权利要求变化。</w:t>
+        <w:t>该族出现了案例声明的核心或必要技术特征信号，建议先核验目标法域国家阶段、独立权利要求和审查历史；现有初筛不能确认所有必要特征被同一独立权利要求组合限定。</w:t>
       </w:r>
     </w:p>
     <w:p>
@@ -6586,7 +6584,7 @@
                 <w:color w:val="1F2937"/>
                 <w:sz w:val="17"/>
               </w:rPr>
-              <w:t>LOW · 初筛分数 0.51</w:t>
+              <w:t>HIGH · 初筛分数 0.74</w:t>
             </w:r>
           </w:p>
         </w:tc>
@@ -6724,7 +6722,7 @@
                 <w:color w:val="1F2937"/>
                 <w:sz w:val="17"/>
               </w:rPr>
-              <w:t>F01 / F02, F03, F04, F05</w:t>
+              <w:t>F01, F02, F04, F05 / F03</w:t>
             </w:r>
           </w:p>
         </w:tc>
@@ -6798,7 +6796,7 @@
           <w:color w:val="1F2937"/>
           <w:sz w:val="19"/>
         </w:rPr>
-        <w:t>当前特征工程只形成部分或背景层命中，尚不足以作为实施障碍结论；仍应检查同族分支、国家阶段、分案/继续申请及权利要求变化。</w:t>
+        <w:t>该族出现了案例声明的核心或必要技术特征信号，建议先核验目标法域国家阶段、独立权利要求和审查历史；现有初筛不能确认所有必要特征被同一独立权利要求组合限定。</w:t>
       </w:r>
     </w:p>
     <w:p>
@@ -7061,7 +7059,7 @@
                 <w:color w:val="1F2937"/>
                 <w:sz w:val="17"/>
               </w:rPr>
-              <w:t>LOW · 初筛分数 0.3467</w:t>
+              <w:t>MEDIUM · 初筛分数 0.4267</w:t>
             </w:r>
           </w:p>
         </w:tc>
@@ -7199,7 +7197,7 @@
                 <w:color w:val="1F2937"/>
                 <w:sz w:val="17"/>
               </w:rPr>
-              <w:t>F01 / F02, F04, F05</w:t>
+              <w:t>F01, F04, F05 / F02</w:t>
             </w:r>
           </w:p>
         </w:tc>
@@ -7273,7 +7271,7 @@
           <w:color w:val="1F2937"/>
           <w:sz w:val="19"/>
         </w:rPr>
-        <w:t>当前特征工程只形成部分或背景层命中，尚不足以作为实施障碍结论；仍应检查同族分支、国家阶段、分案/继续申请及权利要求变化。</w:t>
+        <w:t>该族出现了案例声明的核心或必要技术特征信号，建议先核验目标法域国家阶段、独立权利要求和审查历史；现有初筛不能确认所有必要特征被同一独立权利要求组合限定。</w:t>
       </w:r>
     </w:p>
     <w:p>
@@ -7536,7 +7534,7 @@
                 <w:color w:val="1F2937"/>
                 <w:sz w:val="17"/>
               </w:rPr>
-              <w:t>MEDIUM · 初筛分数 0.7933</w:t>
+              <w:t>HIGH · 初筛分数 0.8733</w:t>
             </w:r>
           </w:p>
         </w:tc>
@@ -7674,7 +7672,7 @@
                 <w:color w:val="1F2937"/>
                 <w:sz w:val="17"/>
               </w:rPr>
-              <w:t>F01, F02 / F03, F04, F05</w:t>
+              <w:t>F01, F02, F03, F04, F05 / 无</w:t>
             </w:r>
           </w:p>
         </w:tc>
@@ -7748,7 +7746,7 @@
           <w:color w:val="1F2937"/>
           <w:sz w:val="19"/>
         </w:rPr>
-        <w:t>该族同时出现研究对象/适应症与 PD-L1 阻断相关核心信号，建议先核验 CN/US 国家阶段、独立权利要求和审查历史；现有数据未确认肺部监测、生化指标和结肠炎处置等必要特征被同一独立权利要求组合限定。</w:t>
+        <w:t>该族出现了案例声明的核心或必要技术特征信号，建议先核验目标法域国家阶段、独立权利要求和审查历史；现有初筛不能确认所有必要特征被同一独立权利要求组合限定。</w:t>
       </w:r>
     </w:p>
     <w:p>
@@ -8011,7 +8009,7 @@
                 <w:color w:val="1F2937"/>
                 <w:sz w:val="17"/>
               </w:rPr>
-              <w:t>LOW · 初筛分数 0.3848</w:t>
+              <w:t>MEDIUM · 初筛分数 0.5348</w:t>
             </w:r>
           </w:p>
         </w:tc>
@@ -8149,7 +8147,7 @@
                 <w:color w:val="1F2937"/>
                 <w:sz w:val="17"/>
               </w:rPr>
-              <w:t>无 / F01, F02, F03, F04, F05</w:t>
+              <w:t>F02 / F01, F03, F04, F05</w:t>
             </w:r>
           </w:p>
         </w:tc>
@@ -8223,7 +8221,7 @@
           <w:color w:val="1F2937"/>
           <w:sz w:val="19"/>
         </w:rPr>
-        <w:t>当前特征工程只形成部分或背景层命中，尚不足以作为实施障碍结论；仍应检查同族分支、国家阶段、分案/继续申请及权利要求变化。</w:t>
+        <w:t>该族出现了案例声明的核心或必要技术特征信号，建议先核验目标法域国家阶段、独立权利要求和审查历史；现有初筛不能确认所有必要特征被同一独立权利要求组合限定。</w:t>
       </w:r>
     </w:p>
     <w:p>
@@ -8486,7 +8484,7 @@
                 <w:color w:val="1F2937"/>
                 <w:sz w:val="17"/>
               </w:rPr>
-              <w:t>LOW · 初筛分数 0.3048</w:t>
+              <w:t>MEDIUM · 初筛分数 0.4548</w:t>
             </w:r>
           </w:p>
         </w:tc>
@@ -8624,7 +8622,7 @@
                 <w:color w:val="1F2937"/>
                 <w:sz w:val="17"/>
               </w:rPr>
-              <w:t>无 / F01, F02, F03, F04, F05</w:t>
+              <w:t>F02 / F01, F03, F04, F05</w:t>
             </w:r>
           </w:p>
         </w:tc>
@@ -8698,7 +8696,7 @@
           <w:color w:val="1F2937"/>
           <w:sz w:val="19"/>
         </w:rPr>
-        <w:t>该族属于邻近技术或竞争边界，当前未建立对度伐利尤单抗拟实施监测方案的完整权利要求联系；保留作为边界线索，需以独立权利要求和法域成员复核。</w:t>
+        <w:t>该族出现了案例声明的核心或必要技术特征信号，建议先核验目标法域国家阶段、独立权利要求和审查历史；现有初筛不能确认所有必要特征被同一独立权利要求组合限定。</w:t>
       </w:r>
     </w:p>
     <w:p>
@@ -8961,7 +8959,7 @@
                 <w:color w:val="1F2937"/>
                 <w:sz w:val="17"/>
               </w:rPr>
-              <w:t>LOW · 初筛分数 0.4</w:t>
+              <w:t>HIGH · 初筛分数 0.63</w:t>
             </w:r>
           </w:p>
         </w:tc>
@@ -9099,7 +9097,7 @@
                 <w:color w:val="1F2937"/>
                 <w:sz w:val="17"/>
               </w:rPr>
-              <w:t>F01 / F02, F03, F04, F05</w:t>
+              <w:t>F01, F02, F04, F05 / F03</w:t>
             </w:r>
           </w:p>
         </w:tc>
@@ -9173,7 +9171,7 @@
           <w:color w:val="1F2937"/>
           <w:sz w:val="19"/>
         </w:rPr>
-        <w:t>该族属于邻近技术或竞争边界，当前未建立对度伐利尤单抗拟实施监测方案的完整权利要求联系；保留作为边界线索，需以独立权利要求和法域成员复核。</w:t>
+        <w:t>该族出现了案例声明的核心或必要技术特征信号，建议先核验目标法域国家阶段、独立权利要求和审查历史；现有初筛不能确认所有必要特征被同一独立权利要求组合限定。</w:t>
       </w:r>
     </w:p>
     <w:p>
@@ -12412,7 +12410,7 @@
                 <w:color w:val="1F2937"/>
                 <w:sz w:val="15"/>
               </w:rPr>
-              <w:t>关键词组合检索</w:t>
+              <w:t>核心对象与用途组合检索</w:t>
             </w:r>
           </w:p>
         </w:tc>
@@ -12456,7 +12454,7 @@
                 <w:color w:val="1F2937"/>
                 <w:sz w:val="15"/>
               </w:rPr>
-              <w:t>锁定研究对象、靶点、适应症和风险/监测场景同时出现的文献。</w:t>
+              <w:t>锁定核心技术特征在标题、摘要和权利要求中的共同披露。 当前词簇：度伐利尤单抗、PD-L1、阻断。</w:t>
             </w:r>
           </w:p>
         </w:tc>
@@ -12478,7 +12476,7 @@
                 <w:color w:val="1F2937"/>
                 <w:sz w:val="15"/>
               </w:rPr>
-              <w:t>("度伐利尤单抗" OR "durvalumab") AND ("PD-L1" OR "程序性死亡配体1") AND ("非小细胞肺癌" OR "NSCLC" OR "non small cell lung cancer") AND ("免疫相关不良反应" OR "irAE" OR "immune related adverse event" OR "器官受损" OR "组织损伤" OR "organ toxicity")</w:t>
+              <w:t>("度伐利尤单抗" OR "durvalumab") AND ("PD-L1" OR "程序性死亡配体1") AND ("阻断" OR "blockade")</w:t>
             </w:r>
           </w:p>
         </w:tc>
@@ -12524,7 +12522,7 @@
                 <w:color w:val="1F2937"/>
                 <w:sz w:val="15"/>
               </w:rPr>
-              <w:t>机制与通路扩展</w:t>
+              <w:t>同义词与机制扩展</w:t>
             </w:r>
           </w:p>
         </w:tc>
@@ -12568,7 +12566,7 @@
                 <w:color w:val="1F2937"/>
                 <w:sz w:val="15"/>
               </w:rPr>
-              <w:t>扩大到 PD-1/PD-L1 结合、阻断、免疫毒性和器官损伤表述。</w:t>
+              <w:t>用案例声明的别名、同义词、译名和机制词扩大召回，并回到权利要求核验。 当前词簇：度伐利尤单抗、PD-L1、阻断、免疫相关不良反应、器官受损。</w:t>
             </w:r>
           </w:p>
         </w:tc>
@@ -12590,7 +12588,7 @@
                 <w:color w:val="1F2937"/>
                 <w:sz w:val="15"/>
               </w:rPr>
-              <w:t>("度伐利尤单抗" OR "durvalumab" OR "德瓦鲁单抗" OR "度伐鲁单抗" OR "PD-L1抑制剂" OR "Imfinzi" OR "MEDI4736" OR "MEDI-4736" OR "PD-L1 inhibitor") AND ("PD-L1" OR "程序性死亡配体1" OR "CD274" OR "B7-H1" OR "programmed death ligand 1" OR "programmed death-ligand 1" OR "阻断" OR "blockade" OR "拮抗" OR "结合抑制" OR "通路阻断" OR "block" OR "inhibit" OR "antagonize") AND ("免疫相关不良反应" OR "irAE" OR "immune related adverse event" OR "自身免疫反应" OR "免疫毒性" OR "autoimmune reaction" OR "immunotoxicity" OR "immune-related adverse event" OR "器官受损" …</w:t>
+              <w:t>("度伐利尤单抗" OR "durvalumab" OR "德瓦鲁单抗" OR "度伐鲁单抗" OR "PD-L1抑制剂" OR "Imfinzi" OR "MEDI4736" OR "MEDI-4736" OR "PD-L1 inhibitor") AND ("PD-L1" OR "程序性死亡配体1" OR "CD274" OR "B7-H1" OR "programmed death ligand 1" OR "programmed death-ligand 1") AND ("阻断" OR "blockade" OR "拮抗" OR "结合抑制" OR "通路阻断" OR "block" OR "inhibit" OR "antagonize") AND ("免疫相关不良反应" OR "irAE" OR "immune related adverse event" OR "自身免疫反应" OR "免疫毒性" OR "autoimmune reaction" OR "immunotoxicity" OR "immune-related adverse event") AND ("…</w:t>
             </w:r>
           </w:p>
         </w:tc>
@@ -12636,7 +12634,7 @@
                 <w:color w:val="1F2937"/>
                 <w:sz w:val="15"/>
               </w:rPr>
-              <w:t>肺部不良事件专项</w:t>
+              <w:t>技术特征分层检索</w:t>
             </w:r>
           </w:p>
         </w:tc>
@@ -12658,7 +12656,7 @@
                 <w:color w:val="1F2937"/>
                 <w:sz w:val="15"/>
               </w:rPr>
-              <w:t>claims, description</w:t>
+              <w:t>claims, description, abstract</w:t>
             </w:r>
           </w:p>
         </w:tc>
@@ -12680,7 +12678,7 @@
                 <w:color w:val="1F2937"/>
                 <w:sz w:val="15"/>
               </w:rPr>
-              <w:t>覆盖免疫相关性肺炎、间质性肺病、肺毒性和呼吸体征连续监测。</w:t>
+              <w:t>围绕尚未覆盖的技术特征分别检索，避免由单一对象词主导结果。 当前词簇：非小细胞肺癌、肺炎/肺毒性、体征监测。</w:t>
             </w:r>
           </w:p>
         </w:tc>
@@ -12702,7 +12700,7 @@
                 <w:color w:val="1F2937"/>
                 <w:sz w:val="15"/>
               </w:rPr>
-              <w:t>("度伐利尤单抗" OR "durvalumab" OR "德瓦鲁单抗" OR "度伐鲁单抗" OR "PD-L1抑制剂" OR "Imfinzi" OR "MEDI4736" OR "MEDI-4736" OR "PD-L1 inhibitor" OR "非小细胞肺癌" OR "NSCLC" OR "non small cell lung cancer" OR "肺腺癌" OR "肺鳞癌" OR "肺癌" OR "lung adenocarcinoma") AND ("肺炎" OR "pneumonitis" OR "间质性肺病" OR "肺部炎症" OR "肺毒性" OR "interstitial lung disease" OR "pneumonia" OR "pulmonary toxicity") AND ("体征监测" OR "monitoring" OR "呼吸监测" OR "肺部听诊" OR "连续监护" OR "respiratory monitoring" OR "physical sign tracking" OR "surveillance" OR "胸部影…</w:t>
+              <w:t>("非小细胞肺癌" OR "NSCLC" OR "non small cell lung cancer" OR "肺腺癌" OR "肺鳞癌" OR "肺癌" OR "lung adenocarcinoma" OR "lung carcinoma" OR "non-small-cell lung cancer") AND ("肺炎" OR "pneumonitis" OR "间质性肺病" OR "肺部炎症" OR "肺毒性" OR "interstitial lung disease" OR "pneumonia" OR "pulmonary toxicity") AND ("体征监测" OR "monitoring" OR "呼吸监测" OR "肺部听诊" OR "连续监护" OR "respiratory monitoring" OR "physical sign tracking" OR "surveillance")</w:t>
             </w:r>
           </w:p>
         </w:tc>
@@ -12748,7 +12746,7 @@
                 <w:color w:val="1F2937"/>
                 <w:sz w:val="15"/>
               </w:rPr>
-              <w:t>生化指标与内分泌监测</w:t>
+              <w:t>实施方式与边界检索</w:t>
             </w:r>
           </w:p>
         </w:tc>
@@ -12792,7 +12790,7 @@
                 <w:color w:val="1F2937"/>
                 <w:sz w:val="15"/>
               </w:rPr>
-              <w:t>覆盖 ALT/AST、肌酐、TSH、游离 T4、血糖等基线和治疗期监测。</w:t>
+              <w:t>补检组成、制剂、给药、检测、工艺或用途等案例实际声明的边界特征。 当前词簇：生化检测、生化指标、胸部影像。</w:t>
             </w:r>
           </w:p>
         </w:tc>
@@ -12814,7 +12812,7 @@
                 <w:color w:val="1F2937"/>
                 <w:sz w:val="15"/>
               </w:rPr>
-              <w:t>("度伐利尤单抗" OR "durvalumab" OR "德瓦鲁单抗" OR "度伐鲁单抗" OR "PD-L1抑制剂" OR "Imfinzi" OR "MEDI4736" OR "MEDI-4736" OR "PD-L1 inhibitor" OR "非小细胞肺癌" OR "NSCLC" OR "non small cell lung cancer" OR "肺腺癌" OR "肺鳞癌" OR "肺癌" OR "lung adenocarcinoma") AND ("生化检测" OR "biochemical test" OR "生化筛查" OR "血液生化" OR "生化分析" OR "biochemical assay" OR "blood chemistry" OR "serum analysis" OR "ALT" OR "AST" OR "肌酐" OR "TSH" OR "游离T4" OR "血糖" OR "transaminase" OR "creatinine")</w:t>
+              <w:t>("生化检测" OR "biochemical test" OR "生化筛查" OR "血液生化" OR "生化分析" OR "biochemical assay" OR "blood chemistry" OR "serum analysis") AND ("ALT" OR "AST" OR "肌酐" OR "TSH" OR "游离T4" OR "血糖" OR "transaminase" OR "creatinine" OR "free T4" OR "blood glucose" OR "alanine aminotransferase" OR "aspartate aminotransferase" OR "thyroid stimulating hormone") AND ("胸部影像" OR "胸部CT" OR "chest imaging" OR "肺部影像" OR "胸片" OR "chest CT" OR "thoracic imaging" OR "chest radiograph")</w:t>
             </w:r>
           </w:p>
         </w:tc>
@@ -12860,7 +12858,7 @@
                 <w:color w:val="1F2937"/>
                 <w:sz w:val="15"/>
               </w:rPr>
-              <w:t>结肠炎与处置方案</w:t>
+              <w:t>未充分命中特征补检</w:t>
             </w:r>
           </w:p>
         </w:tc>
@@ -12882,7 +12880,7 @@
                 <w:color w:val="1F2937"/>
                 <w:sz w:val="15"/>
               </w:rPr>
-              <w:t>claims, description</w:t>
+              <w:t>claims, description, CPC/IPC</w:t>
             </w:r>
           </w:p>
         </w:tc>
@@ -12904,7 +12902,7 @@
                 <w:color w:val="1F2937"/>
                 <w:sz w:val="15"/>
               </w:rPr>
-              <w:t>覆盖腹泻分级、结肠炎、皮质类固醇和治疗决策。</w:t>
+              <w:t>根据初筛中未命中或仅部分命中的技术特征，补充术语、别名、译名、分类号和相邻实施方式。</w:t>
             </w:r>
           </w:p>
         </w:tc>
@@ -12926,7 +12924,7 @@
                 <w:color w:val="1F2937"/>
                 <w:sz w:val="15"/>
               </w:rPr>
-              <w:t>("度伐利尤单抗" OR "durvalumab" OR "德瓦鲁单抗" OR "度伐鲁单抗" OR "PD-L1抑制剂" OR "Imfinzi" OR "MEDI4736" OR "MEDI-4736" OR "PD-L1 inhibitor") AND ("结肠炎" OR "colitis" OR "肠道炎症" OR "腹泻" OR "肠毒性" OR "diarrhea" OR "bowel inflammation" OR "enterocolitis") AND ("皮质类固醇" OR "corticosteroid" OR "糖皮质激素" OR "激素治疗" OR "类固醇" OR "glucocorticoid" OR "steroid" OR "prednisone")</w:t>
+              <w:t>("度伐利尤单抗" OR "durvalumab" OR "德瓦鲁单抗" OR "度伐鲁单抗" OR "PD-L1抑制剂" OR "Imfinzi" OR "MEDI4736" OR "MEDI-4736" OR "PD-L1 inhibitor") AND ("PD-L1" OR "程序性死亡配体1" OR "CD274" OR "B7-H1" OR "programmed death ligand 1" OR "programmed death-ligand 1") AND ("阻断" OR "blockade" OR "拮抗" OR "结合抑制" OR "通路阻断" OR "block" OR "inhibit" OR "antagonize") AND ("免疫相关不良反应" OR "irAE" OR "immune related adverse event" OR "自身免疫反应" OR "免疫毒性" OR "autoimmune reaction" OR "immunotoxicity" OR "immune-related adverse event") AND ("…</w:t>
             </w:r>
           </w:p>
         </w:tc>
@@ -13016,7 +13014,7 @@
                 <w:color w:val="1F2937"/>
                 <w:sz w:val="15"/>
               </w:rPr>
-              <w:t>用分类号补足检测、抗体、免疫治疗和医疗数据分析类漏检。</w:t>
+              <w:t>用当前案例声明或从高相关文献反向确认的分类号补足漏检。</w:t>
             </w:r>
           </w:p>
         </w:tc>
@@ -13038,7 +13036,7 @@
                 <w:color w:val="1F2937"/>
                 <w:sz w:val="15"/>
               </w:rPr>
-              <w:t>("PD-L1" OR "程序性死亡配体1" OR "CD274" OR "B7-H1" OR "programmed death ligand 1" OR "programmed death-ligand 1" OR "非小细胞肺癌" OR "NSCLC" OR "non small cell lung cancer" OR "肺腺癌" OR "肺鳞癌" OR "肺癌" OR "lung adenocarcinoma" OR "lung carcinoma" OR "non-small-cell lung cancer") AND ("体征监测" OR "monitoring" OR "呼吸监测" OR "肺部听诊" OR "连续监护" OR "respiratory monitoring" OR "physical sign tracking" OR "surveillance" OR "生化检测" OR "biochemical test" OR "生化筛查" OR "血液生化" OR "生化分析" OR "biochemical assay" OR "blood chemis…</w:t>
+              <w:t>("度伐利尤单抗" OR "durvalumab" OR "德瓦鲁单抗" OR "度伐鲁单抗" OR "PD-L1抑制剂" OR "Imfinzi" OR "MEDI4736" OR "MEDI-4736" OR "PD-L1 inhibitor") AND ("PD-L1" OR "程序性死亡配体1" OR "CD274" OR "B7-H1" OR "programmed death ligand 1" OR "programmed death-ligand 1") AND ("阻断" OR "blockade" OR "拮抗" OR "结合抑制" OR "通路阻断" OR "block" OR "inhibit" OR "antagonize") AND ("A61P11/00" OR "A61P43/00" OR "A61K39/395" OR "C07K16/28" OR "A61P37/04" OR "G16H50/30" OR "A61P35/00" OR "C07K16/2818" OR "G01N33/68" OR "A61P35/02" OR "A61P37/02…</w:t>
             </w:r>
           </w:p>
         </w:tc>
@@ -13830,7 +13828,7 @@
         <w:color w:val="667085"/>
         <w:sz w:val="16"/>
       </w:rPr>
-      <w:t xml:space="preserve">FTO · 2026-08-06 · </w:t>
+      <w:t xml:space="preserve">FTO · 2026-08-07 · </w:t>
     </w:r>
     <w:r>
       <w:rPr>
@@ -13866,7 +13864,7 @@
         <w:color w:val="667085"/>
         <w:sz w:val="16"/>
       </w:rPr>
-      <w:t xml:space="preserve">FTO · 2026-08-06 · </w:t>
+      <w:t xml:space="preserve">FTO · 2026-08-07 · </w:t>
     </w:r>
     <w:r>
       <w:rPr>
@@ -13902,7 +13900,7 @@
         <w:color w:val="667085"/>
         <w:sz w:val="16"/>
       </w:rPr>
-      <w:t xml:space="preserve">FTO · 2026-08-06 · </w:t>
+      <w:t xml:space="preserve">FTO · 2026-08-07 · </w:t>
     </w:r>
     <w:r>
       <w:rPr>

</xml_diff>